<commit_message>
Add EU-SILC (2018-2025, cross-sectional and longitudinal) to the Eurostat proposal draft
Co-Authored-By: Claude Fable 5.1 <noreply@anthropic.com>
</commit_message>
<xml_diff>
--- a/docs/design/eu-lfs-research-proposal-draft.docx
+++ b/docs/design/eu-lfs-research-proposal-draft.docx
@@ -25,7 +25,7 @@
           <w:i/>
           <w:color w:val="555555"/>
         </w:rPr>
-        <w:t>Access to EU Labour Force Survey scientific-use files. Draft prepared 12 September 2026 (revised for the 2025 reference year) for entry into the Eurostat microdata access portal, following the numbering of Research proposal application form v2.2. Yellow fields are for the applicant to complete; everything else is proposed text.</w:t>
+        <w:t>Access to EU Labour Force Survey and EU-SILC scientific-use files. Draft prepared 12 September 2026 (revised for the 2025 reference year) for entry into the Eurostat microdata access portal, following the numbering of Research proposal application form v2.2. Yellow fields are for the applicant to complete; everything else is proposed text.</w:t>
       </w:r>
     </w:p>
     <w:p>
@@ -484,7 +484,7 @@
           <w:b w:val="0"/>
           <w:i w:val="0"/>
         </w:rPr>
-        <w:t>Generative AI exposure and occupational employment dynamics in Europe and emerging economies: evidence from harmonised labour force surveys, 2021-2025</w:t>
+        <w:t>Generative AI exposure and occupational employment dynamics in Europe and emerging economies: evidence from harmonised labour force surveys and EU-SILC, 2021-2025</w:t>
       </w:r>
     </w:p>
     <w:p>
@@ -677,7 +677,7 @@
               <w:rPr>
                 <w:b/>
               </w:rPr>
-              <w:t>4.1 Dataset</w:t>
+              <w:t>4.1 Datasets</w:t>
             </w:r>
           </w:p>
         </w:tc>
@@ -687,7 +687,7 @@
           </w:tcPr>
           <w:p>
             <w:r>
-              <w:t>Labour Force Survey (LFS)</w:t>
+              <w:t>Labour Force Survey (LFS); European Union Statistics on Income and Living Conditions (EU-SILC), cross-sectional and longitudinal files</w:t>
             </w:r>
           </w:p>
         </w:tc>
@@ -791,7 +791,7 @@
           <w:b w:val="0"/>
           <w:i w:val="0"/>
         </w:rPr>
-        <w:t>Variable groups (identifiers as in the 2021 legal acts):</w:t>
+        <w:t>LFS variable groups (identifiers as in the 2021 legal acts):</w:t>
       </w:r>
     </w:p>
     <w:p>
@@ -849,11 +849,21 @@
       </w:r>
     </w:p>
     <w:p>
+      <w:pPr/>
+      <w:r>
+        <w:rPr>
+          <w:b w:val="0"/>
+          <w:sz w:val="22"/>
+        </w:rPr>
+        <w:t>EU-SILC. Reference years 2018 to 2025 (the 2025 cross-sectional and longitudinal files were released in June 2026), all countries in the file. Target population: persons aged 16 to 64. Variable groups: identifiers and weights (DB010, DB020, DB030, RB030, PB030, DB075 rotation group, PB040, RB060/RB062/RB064 longitudinal weights); person characteristics (RB080/RB090 or PB140/PB150, PE041); labour status and calendar (PL031/PL032, PL211A to PL211L monthly activity, PL073 to PL076 months worked); job characteristics (PL051A occupation ISCO-08 as delivered, PL111A activity NACE as delivered, PL040A status in employment, PL141 contract type, PL145 full or part time, PL060 hours, PL200 years in paid work, PL190 age at first job, PL160 change of job since last interview and PL170 reason); income (PY010G/N employee cash income, PY020 non-cash, PY050 self-employment).</w:t>
+      </w:r>
+    </w:p>
+    <w:p>
       <w:pPr>
         <w:pStyle w:val="Heading2"/>
       </w:pPr>
       <w:r>
-        <w:t>4.4 How the dataset will be used</w:t>
+        <w:t>4.4 How the datasets will be used</w:t>
       </w:r>
     </w:p>
     <w:p>
@@ -865,7 +875,7 @@
           <w:b w:val="0"/>
           <w:i w:val="0"/>
         </w:rPr>
-        <w:t>The quarterly files are the core input. They are aggregated to country by quarter by three-digit occupation by five-year age group by sex cells (employment using COEFFQ, shares of recent hires, temporary contracts and part-time work, usual hours), which form the estimation panel. The yearly files supply the structural variables (firm size, supervisory role, temporary-agency contract, field of education, income deciles) for heterogeneity analysis at the same cell level. Only the LFS is requested; it is not combined with any other Eurostat dataset. The cell panel is merged with occupation-level exposure indices and with country-level indicators from public sources (Eurostat aggregate tables, OECD, national AI-adoption surveys), never with other individual-level data.</w:t>
+        <w:t>The quarterly files are the core input. They are aggregated to country by quarter by three-digit occupation by five-year age group by sex cells (employment using COEFFQ, shares of recent hires, temporary contracts and part-time work, usual hours), which form the estimation panel. The yearly files supply the structural variables (firm size, supervisory role, temporary-agency contract, field of education, income deciles) for heterogeneity analysis at the same cell level. Only the LFS is requested; it is not combined with any other Eurostat dataset. The cell panel is merged with occupation-level exposure indices and with country-level indicators from public sources (Eurostat aggregate tables, OECD, national AI-adoption surveys), never with other individual-level data. EU-SILC serves the person-level part of the study, which the LFS scientific-use file cannot support because its records do not link across quarters: the longitudinal file follows persons over the four annual waves of a rotation group, so the probability that a worker in an exposed occupation (at the ISCO level delivered) changes job, leaves employment or moves out of the occupation after 2022 is estimated at the person level, with the monthly activity calendar dating exits and entries within the year and PL160/PL170 identifying job changes; the cross-sectional file adds the earnings margin, comparing growth in employee income across exposure groups. The two datasets are analysed separately and are not linked to each other at the record level.</w:t>
       </w:r>
     </w:p>
     <w:p>
@@ -885,7 +895,7 @@
           <w:b w:val="0"/>
           <w:i w:val="0"/>
         </w:rPr>
-        <w:t>Descriptive employment indices by exposure tercile and age group; two-way and high-dimensional fixed-effects regressions on the cell panel (event study, difference in differences, triple difference, continuous treatment) estimated by weighted least squares with cluster-robust standard errors and a wild-cluster bootstrap where clusters are few; leave-one-country-out and synthetic-control robustness; sensitivity to the occupational aggregation level (two versus three digits) and to alternative exposure indices. Estimation in Python (statsmodels, linearmodels, pyfixest) and Stata.</w:t>
+        <w:t>Descriptive employment indices by exposure tercile and age group; two-way and high-dimensional fixed-effects regressions on the cell panel (event study, difference in differences, triple difference, continuous treatment) estimated by weighted least squares with cluster-robust standard errors and a wild-cluster bootstrap where clusters are few; leave-one-country-out and synthetic-control robustness; sensitivity to the occupational aggregation level (two versus three digits) and to alternative exposure indices. For EU-SILC: person-level linear probability and logit models of job change, exit and occupational mobility on exposure, age and their interaction with a post-2022 indicator, with country and year fixed effects and the longitudinal weights; earnings regressions on the cross-sectional files. Estimation in Python (statsmodels, linearmodels, pyfixest) and Stata.</w:t>
       </w:r>
     </w:p>
     <w:p>
@@ -913,7 +923,7 @@
           <w:b w:val="0"/>
           <w:i w:val="0"/>
         </w:rPr>
-        <w:t>Estimates, with confidence intervals, of the change in employment, in the recent-hire share and in the temporary-contract share of high-exposure occupations relative to low-exposure occupations after 2022Q4, overall and by age group, for the European countries pooled and by country group, and a comparison with the same estimates for thirteen emerging economies. The output consists of regression tables, event-study figures and aggregate cell-level indices that meet the publication thresholds. No individual-level derived dataset and no synthetic dataset will be produced or released.</w:t>
+        <w:t>Estimates, with confidence intervals, of the change in employment, in the recent-hire share and in the temporary-contract share of high-exposure occupations relative to low-exposure occupations after 2022Q4, overall and by age group, for the European countries pooled and by country group, and a comparison with the same estimates for thirteen emerging economies. The output consists of regression tables, event-study figures and aggregate cell-level indices that meet the publication thresholds. From EU-SILC: estimates of the change after 2022 in job-change, exit and earnings outcomes for workers in exposed occupations relative to others, by age group. No individual-level derived dataset and no synthetic dataset will be produced or released.</w:t>
       </w:r>
     </w:p>
     <w:p>
@@ -1047,7 +1057,7 @@
           <w:b w:val="0"/>
           <w:i w:val="0"/>
         </w:rPr>
-        <w:t>All results are aggregates over cells defined by country, quarter, three-digit occupation, five-year age group and sex, or regression coefficients estimated from such cells. Following Eurostat's Guidelines for publication for LFS scientific-use files, no figure based on three or fewer unweighted observations will be published; estimates below each country's reliability limit 'a' will be suppressed and those between limits 'a' and 'b' flagged as of limited reliability; no table at single-year age will be published; occupation will never be shown below the three-digit level delivered, nor region below NUTS 2. Cells under the threshold are dropped before estimation or merged into the parent two-digit occupation, and any released cell-level index carries its unweighted count so that suppression can be verified. Regression output reveals no individual record. The files, intermediate extracts and all copies are held only on the designated World Bank machine and destroyed at the end of the project.</w:t>
+        <w:t>All LFS results are aggregates over cells defined by country, quarter, three-digit occupation, five-year age group and sex, or regression coefficients estimated from such cells; all EU-SILC results are regression coefficients or weighted means over groups of at least 30 persons. Following Eurostat's Guidelines for publication for LFS scientific-use files, no figure based on three or fewer unweighted observations will be published; estimates below each country's reliability limit 'a' will be suppressed and those between limits 'a' and 'b' flagged as of limited reliability; no table at single-year age will be published; occupation will never be shown below the three-digit level delivered, nor region below NUTS 2. Cells under the threshold are dropped before estimation or merged into the parent two-digit occupation, and any released cell-level index carries its unweighted count so that suppression can be verified. Regression output reveals no individual record. The files, intermediate extracts and all copies are held only on the designated World Bank machine and destroyed at the end of the project.</w:t>
       </w:r>
     </w:p>
     <w:p>

</xml_diff>